<commit_message>
Rebuild IEEE docx with new GitHub home URL.
Co-authored-by: Cursor <cursoragent@cursor.com>
</commit_message>
<xml_diff>
--- a/paper/ieee/NeuroTrace-DAG_IEEE_A4_Conference.docx
+++ b/paper/ieee/NeuroTrace-DAG_IEEE_A4_Conference.docx
@@ -2305,7 +2305,7 @@
           <w:i w:val="0"/>
           <w:sz w:val="20"/>
         </w:rPr>
-        <w:t>Thanks to advisors and collaborators for comments on framing and scope. Code and prereg packet: https://github.com/Hisana-07/neurotrace-dag (tag prereg-v1).</w:t>
+        <w:t>Thanks to advisors and collaborators for comments on framing and scope. Code and prereg packet: https://github.com/Oscar-man-shrestha/eval-validity-edu (tag prereg-v1).</w:t>
       </w:r>
     </w:p>
     <w:p>
@@ -2433,7 +2433,7 @@
           <w:i w:val="0"/>
           <w:sz w:val="18"/>
         </w:rPr>
-        <w:t>[7] NeuroTrace-DAG contributors, “Preregistration packet prereg-v1,” GitHub release, 2026. [Online]. Available: https://github.com/Hisana-07/neurotrace-dag/releases/tag/prereg-v1</w:t>
+        <w:t>[7] NeuroTrace-DAG contributors, “Preregistration packet prereg-v1,” GitHub release, 2026. [Online]. Available: https://github.com/Oscar-man-shrestha/eval-validity-edu/releases/tag/prereg-v1</w:t>
       </w:r>
     </w:p>
     <w:p>

</xml_diff>